<commit_message>
Frontend synopsis, update packages
Co-Authored-By: Romit-p <250198989+Romit-p@users.noreply.github.com>
Co-Authored-By: Roopesh <roopeshroopii16@gmail.com>
Co-Authored-By: RudraPratap-67 <233050661+RudraPratap-67@users.noreply.github.com>
</commit_message>
<xml_diff>
--- a/PP1-Synopsis.docx
+++ b/PP1-Synopsis.docx
@@ -672,52 +672,7 @@
           <w:sz w:val="26"/>
           <w:szCs w:val="26"/>
         </w:rPr>
-        <w:t>Feb</w:t>
-      </w:r>
-      <w:r>
-        <w:rPr>
-          <w:rFonts w:ascii="Times New Roman" w:hAnsi="Times New Roman" w:cs="Times New Roman"/>
-          <w:b/>
-          <w:sz w:val="26"/>
-          <w:szCs w:val="26"/>
-        </w:rPr>
-        <w:t xml:space="preserve"> 202</w:t>
-      </w:r>
-      <w:r>
-        <w:rPr>
-          <w:rFonts w:ascii="Times New Roman" w:hAnsi="Times New Roman" w:cs="Times New Roman"/>
-          <w:b/>
-          <w:sz w:val="26"/>
-          <w:szCs w:val="26"/>
-        </w:rPr>
-        <w:t>6</w:t>
-      </w:r>
-      <w:r>
-        <w:rPr>
-          <w:rFonts w:ascii="Times New Roman" w:hAnsi="Times New Roman" w:cs="Times New Roman"/>
-          <w:b/>
-          <w:sz w:val="26"/>
-          <w:szCs w:val="26"/>
-        </w:rPr>
-        <w:t xml:space="preserve"> – J</w:t>
-      </w:r>
-      <w:r>
-        <w:rPr>
-          <w:rFonts w:ascii="Times New Roman" w:hAnsi="Times New Roman" w:cs="Times New Roman"/>
-          <w:b/>
-          <w:sz w:val="26"/>
-          <w:szCs w:val="26"/>
-        </w:rPr>
-        <w:t>uly</w:t>
-      </w:r>
-      <w:r>
-        <w:rPr>
-          <w:rFonts w:ascii="Times New Roman" w:hAnsi="Times New Roman" w:cs="Times New Roman"/>
-          <w:b/>
-          <w:sz w:val="26"/>
-          <w:szCs w:val="26"/>
-        </w:rPr>
-        <w:t xml:space="preserve"> 2026</w:t>
+        <w:t>Feb 2026 – July 2026</w:t>
       </w:r>
     </w:p>
     <w:p>
@@ -1558,7 +1513,38 @@
           <w:lang w:val="en-IN"/>
         </w:rPr>
         <w:br/>
-        <w:t>– Android Studio (for Android Emulator)</w:t>
+        <w:t xml:space="preserve">– </w:t>
+      </w:r>
+      <w:r>
+        <w:rPr>
+          <w:rFonts w:ascii="Times New Roman" w:hAnsi="Times New Roman" w:cs="Times New Roman"/>
+          <w:lang w:val="en-IN"/>
+        </w:rPr>
+        <w:t>Expo CLI</w:t>
+      </w:r>
+    </w:p>
+    <w:p>
+      <w:pPr>
+        <w:rPr>
+          <w:rFonts w:ascii="Times New Roman" w:hAnsi="Times New Roman" w:cs="Times New Roman"/>
+          <w:lang w:val="en-IN"/>
+        </w:rPr>
+      </w:pPr>
+      <w:r>
+        <w:rPr>
+          <w:rFonts w:ascii="Times New Roman" w:hAnsi="Times New Roman" w:cs="Times New Roman"/>
+          <w:lang w:val="en-IN"/>
+        </w:rPr>
+        <w:t xml:space="preserve">• </w:t>
+      </w:r>
+      <w:r>
+        <w:rPr>
+          <w:rFonts w:ascii="Times New Roman" w:hAnsi="Times New Roman" w:cs="Times New Roman"/>
+          <w:b/>
+          <w:bCs/>
+          <w:lang w:val="en-IN"/>
+        </w:rPr>
+        <w:t>Backend Technologies</w:t>
       </w:r>
       <w:r>
         <w:rPr>
@@ -1566,8 +1552,54 @@
           <w:lang w:val="en-IN"/>
         </w:rPr>
         <w:br/>
-        <w:t>– Android SDK</w:t>
-      </w:r>
+        <w:t xml:space="preserve">– </w:t>
+      </w:r>
+      <w:r>
+        <w:rPr>
+          <w:rFonts w:ascii="Times New Roman" w:hAnsi="Times New Roman" w:cs="Times New Roman"/>
+          <w:lang w:val="en-IN"/>
+        </w:rPr>
+        <w:t>React Native</w:t>
+      </w:r>
+      <w:r>
+        <w:rPr>
+          <w:rFonts w:ascii="Times New Roman" w:hAnsi="Times New Roman" w:cs="Times New Roman"/>
+          <w:lang w:val="en-IN"/>
+        </w:rPr>
+        <w:br/>
+        <w:t xml:space="preserve">– </w:t>
+      </w:r>
+      <w:r>
+        <w:rPr>
+          <w:rFonts w:ascii="Times New Roman" w:hAnsi="Times New Roman" w:cs="Times New Roman"/>
+          <w:lang w:val="en-IN"/>
+        </w:rPr>
+        <w:t>Expo Router</w:t>
+      </w:r>
+    </w:p>
+    <w:p>
+      <w:pPr>
+        <w:rPr>
+          <w:rFonts w:ascii="Times New Roman" w:hAnsi="Times New Roman" w:cs="Times New Roman"/>
+          <w:lang w:val="en-IN"/>
+        </w:rPr>
+      </w:pPr>
+      <w:r>
+        <w:rPr>
+          <w:rFonts w:ascii="Times New Roman" w:hAnsi="Times New Roman" w:cs="Times New Roman"/>
+          <w:lang w:val="en-IN"/>
+        </w:rPr>
+        <w:t xml:space="preserve">– </w:t>
+      </w:r>
+      <w:proofErr w:type="spellStart"/>
+      <w:r>
+        <w:rPr>
+          <w:rFonts w:ascii="Times New Roman" w:hAnsi="Times New Roman" w:cs="Times New Roman"/>
+          <w:lang w:val="en-IN"/>
+        </w:rPr>
+        <w:t>Zustand</w:t>
+      </w:r>
+      <w:proofErr w:type="spellEnd"/>
     </w:p>
     <w:p>
       <w:pPr>
@@ -2544,6 +2576,7 @@
   <w:style w:type="character" w:default="1" w:styleId="DefaultParagraphFont">
     <w:name w:val="Default Paragraph Font"/>
     <w:uiPriority w:val="1"/>
+    <w:semiHidden/>
     <w:unhideWhenUsed/>
   </w:style>
   <w:style w:type="table" w:default="1" w:styleId="TableNormal">

</xml_diff>